<commit_message>
refactor(lab4): replace ё to е
</commit_message>
<xml_diff>
--- a/2_semester/NeuralNetworks/lab4/report/1306_ShavrinAP_lab4.docx
+++ b/2_semester/NeuralNetworks/lab4/report/1306_ShavrinAP_lab4.docx
@@ -284,16 +284,7 @@
           <w:szCs w:val="28"/>
           <w:lang w:eastAsia="ru-RU" w:bidi="ar-SA"/>
         </w:rPr>
-        <w:t>те №</w:t>
-      </w:r>
-      <w:r>
-        <w:rPr>
-          <w:b/>
-          <w:color w:val="auto"/>
-          <w:szCs w:val="28"/>
-          <w:lang w:eastAsia="ru-RU" w:bidi="ar-SA"/>
-        </w:rPr>
-        <w:t>4</w:t>
+        <w:t>те №4</w:t>
       </w:r>
     </w:p>
     <w:p>
@@ -457,9 +448,9 @@
         </w:tblCellMar>
       </w:tblPr>
       <w:tblGrid>
-        <w:gridCol w:w="4345"/>
+        <w:gridCol w:w="4344"/>
         <w:gridCol w:w="2609"/>
-        <w:gridCol w:w="2900"/>
+        <w:gridCol w:w="2901"/>
       </w:tblGrid>
       <w:tr>
         <w:trPr>
@@ -467,7 +458,7 @@
         </w:trPr>
         <w:tc>
           <w:tcPr>
-            <w:tcW w:w="4345" w:type="dxa"/>
+            <w:tcW w:w="4344" w:type="dxa"/>
             <w:tcBorders/>
             <w:vAlign w:val="bottom"/>
           </w:tcPr>
@@ -512,7 +503,7 @@
         </w:tc>
         <w:tc>
           <w:tcPr>
-            <w:tcW w:w="2900" w:type="dxa"/>
+            <w:tcW w:w="2901" w:type="dxa"/>
             <w:tcBorders/>
             <w:vAlign w:val="bottom"/>
           </w:tcPr>
@@ -541,7 +532,7 @@
         </w:trPr>
         <w:tc>
           <w:tcPr>
-            <w:tcW w:w="4345" w:type="dxa"/>
+            <w:tcW w:w="4344" w:type="dxa"/>
             <w:tcBorders/>
             <w:vAlign w:val="bottom"/>
           </w:tcPr>
@@ -587,7 +578,7 @@
         </w:tc>
         <w:tc>
           <w:tcPr>
-            <w:tcW w:w="2900" w:type="dxa"/>
+            <w:tcW w:w="2901" w:type="dxa"/>
             <w:tcBorders/>
             <w:vAlign w:val="bottom"/>
           </w:tcPr>
@@ -723,16 +714,14 @@
     <w:p>
       <w:pPr>
         <w:pStyle w:val="Textbody"/>
-        <w:ind w:hanging="0" w:left="0"/>
+        <w:ind w:hanging="0" w:left="0" w:right="0"/>
         <w:jc w:val="center"/>
         <w:rPr>
           <w:color w:val="auto"/>
         </w:rPr>
       </w:pPr>
       <w:r>
-        <w:rPr>
-          <w:color w:val="auto"/>
-        </w:rPr>
+        <w:rPr/>
         <w:drawing>
           <wp:inline distT="0" distB="0" distL="0" distR="0">
             <wp:extent cx="2339340" cy="1851660"/>
@@ -1041,7 +1030,7 @@
     <w:p>
       <w:pPr>
         <w:pStyle w:val="Standard"/>
-        <w:ind w:hanging="0" w:left="0"/>
+        <w:ind w:hanging="0" w:left="0" w:right="0"/>
         <w:rPr>
           <w:color w:val="auto"/>
           <w:szCs w:val="28"/>
@@ -1070,11 +1059,7 @@
         </w:rPr>
       </w:pPr>
       <w:r>
-        <w:rPr>
-          <w:color w:val="auto"/>
-          <w:szCs w:val="28"/>
-          <w:lang w:eastAsia="ru-RU" w:bidi="ar-SA"/>
-        </w:rPr>
+        <w:rPr/>
         <w:drawing>
           <wp:inline distT="0" distB="0" distL="0" distR="0">
             <wp:extent cx="4155440" cy="2525395"/>
@@ -1159,6 +1144,7 @@
           <w:ilvl w:val="0"/>
           <w:numId w:val="3"/>
         </w:numPr>
+        <w:ind w:hanging="360" w:left="720" w:right="0"/>
         <w:rPr>
           <w:color w:val="auto"/>
           <w:szCs w:val="28"/>
@@ -1181,6 +1167,7 @@
           <w:ilvl w:val="0"/>
           <w:numId w:val="3"/>
         </w:numPr>
+        <w:ind w:hanging="360" w:left="720" w:right="0"/>
         <w:rPr>
           <w:color w:val="auto"/>
           <w:szCs w:val="28"/>
@@ -1203,6 +1190,7 @@
           <w:ilvl w:val="0"/>
           <w:numId w:val="3"/>
         </w:numPr>
+        <w:ind w:hanging="360" w:left="720" w:right="0"/>
         <w:rPr>
           <w:color w:val="auto"/>
           <w:szCs w:val="28"/>
@@ -1251,15 +1239,7 @@
           <w:szCs w:val="28"/>
           <w:lang w:eastAsia="ru-RU" w:bidi="ar-SA"/>
         </w:rPr>
-        <w:t xml:space="preserve">Для удобства проведения экспериментов написана функция, которая создает модель заданной архитектуры, затем компилирует ее с переданным оптимизатором, функцией потерь categorical_crossentropy и метрикой точности, а после обучает модель на обучающей выборке в течение 5 эпох с размером пакета 128 и оценивает точность на тестовой выборке, с последующим возвратом истории обучения и значением точности. Это позволило систематически исследовать различные оптимизаторы и их параметры без дублирования кода. Функции генерации модели и обучения представленны на рисунке </w:t>
-      </w:r>
-      <w:r>
-        <w:rPr>
-          <w:color w:val="auto"/>
-          <w:szCs w:val="28"/>
-          <w:lang w:eastAsia="ru-RU" w:bidi="ar-SA"/>
-        </w:rPr>
-        <w:t>2.</w:t>
+        <w:t>Для удобства проведения экспериментов написана функция, которая создает модель заданной архитектуры, затем компилирует ее с переданным оптимизатором, функцией потерь categorical_crossentropy и метрикой точности, а после обучает модель на обучающей выборке в течение 5 эпох с размером пакета 128 и оценивает точность на тестовой выборке, с последующим возвратом истории обучения и значением точности. Это позволило систематически исследовать различные оптимизаторы и их параметры без дублирования кода. Функции генерации модели и обучения представленны на рисунке 2.</w:t>
       </w:r>
     </w:p>
     <w:p>
@@ -1274,7 +1254,7 @@
       </w:pPr>
       <w:r>
         <w:drawing>
-          <wp:anchor distT="0" distB="0" distL="0" distR="0" simplePos="0" relativeHeight="4" behindDoc="0" locked="0" layoutInCell="0" allowOverlap="1">
+          <wp:anchor distT="0" distB="0" distL="0" distR="0" simplePos="0" relativeHeight="11" behindDoc="0" locked="0" layoutInCell="0" allowOverlap="1">
             <wp:simplePos x="0" y="0"/>
             <wp:positionH relativeFrom="column">
               <wp:align>center</wp:align>
@@ -1322,15 +1302,7 @@
       </w:r>
       <w:r>
         <w:rPr/>
-        <w:t xml:space="preserve">Рисунок </w:t>
-      </w:r>
-      <w:r>
-        <w:rPr/>
-        <w:t>2</w:t>
-      </w:r>
-      <w:r>
-        <w:rPr/>
-        <w:t xml:space="preserve">. </w:t>
+        <w:t xml:space="preserve">Рисунок 2. </w:t>
       </w:r>
       <w:r>
         <w:rPr>
@@ -1451,17 +1423,7 @@
           <w:szCs w:val="28"/>
           <w:lang w:eastAsia="ru-RU" w:bidi="ar-SA"/>
         </w:rPr>
-        <w:t>Б</w:t>
-      </w:r>
-      <w:r>
-        <w:rPr>
-          <w:b w:val="false"/>
-          <w:bCs w:val="false"/>
-          <w:color w:val="auto"/>
-          <w:szCs w:val="28"/>
-          <w:lang w:eastAsia="ru-RU" w:bidi="ar-SA"/>
-        </w:rPr>
-        <w:t xml:space="preserve">азовый метод оптимизации, обновляющий веса модели в направлении, противоположном градиенту функции потерь, вычисленному на небольшом пакете данных. </w:t>
+        <w:t xml:space="preserve">Базовый метод оптимизации, обновляющий веса модели в направлении, противоположном градиенту функции потерь, вычисленному на небольшом пакете данных. </w:t>
       </w:r>
       <w:r>
         <w:rPr>
@@ -1491,12 +1453,7 @@
         </w:rPr>
       </w:pPr>
       <w:r>
-        <w:rPr>
-          <w:rFonts w:eastAsia="Times New Roman" w:cs="Times New Roman" w:ascii="Times New Roman" w:hAnsi="Times New Roman"/>
-          <w:sz w:val="28"/>
-          <w:szCs w:val="28"/>
-          <w:lang w:eastAsia="ru-RU" w:bidi="ar-SA"/>
-        </w:rPr>
+        <w:rPr/>
       </w:r>
       <m:oMathPara xmlns:m="http://schemas.openxmlformats.org/officeDocument/2006/math">
         <m:oMathParaPr>
@@ -1526,6 +1483,10 @@
                     <m:t xml:space="preserve">t</m:t>
                   </m:r>
                   <m:r>
+                    <m:rPr>
+                      <m:lit/>
+                      <m:nor/>
+                    </m:rPr>
                     <w:rPr>
                       <w:rFonts w:ascii="Cambria Math" w:hAnsi="Cambria Math"/>
                     </w:rPr>
@@ -1548,6 +1509,10 @@
             <m:t xml:space="preserve">​</m:t>
           </m:r>
           <m:r>
+            <m:rPr>
+              <m:lit/>
+              <m:nor/>
+            </m:rPr>
             <w:rPr>
               <w:rFonts w:ascii="Cambria Math" w:hAnsi="Cambria Math"/>
             </w:rPr>
@@ -1684,7 +1649,7 @@
           <w:szCs w:val="28"/>
           <w:lang w:eastAsia="ru-RU" w:bidi="ar-SA"/>
         </w:rPr>
-        <w:t>Модификация с моментом (momentum): Добавление момента позволяет ускорить сходимость и сгладить колебания. Обновление происходит с учётом предыдущего шага:</w:t>
+        <w:t>Модификация с моментом (momentum): Добавление момента позволяет ускорить сходимость и сгладить колебания. Обновление происходит с учетом предыдущего шага:</w:t>
       </w:r>
     </w:p>
     <w:p>
@@ -1705,13 +1670,7 @@
         </w:rPr>
       </w:pPr>
       <w:r>
-        <w:rPr>
-          <w:b w:val="false"/>
-          <w:bCs w:val="false"/>
-          <w:color w:val="auto"/>
-          <w:szCs w:val="28"/>
-          <w:lang w:eastAsia="ru-RU" w:bidi="ar-SA"/>
-        </w:rPr>
+        <w:rPr/>
       </w:r>
       <m:oMathPara xmlns:m="http://schemas.openxmlformats.org/officeDocument/2006/math">
         <m:oMathParaPr>
@@ -1737,6 +1696,10 @@
             </m:sub>
           </m:sSub>
           <m:r>
+            <m:rPr>
+              <m:lit/>
+              <m:nor/>
+            </m:rPr>
             <w:rPr>
               <w:rFonts w:ascii="Cambria Math" w:hAnsi="Cambria Math"/>
             </w:rPr>
@@ -1851,13 +1814,7 @@
         </w:rPr>
       </w:pPr>
       <w:r>
-        <w:rPr>
-          <w:b w:val="false"/>
-          <w:bCs w:val="false"/>
-          <w:color w:val="auto"/>
-          <w:szCs w:val="28"/>
-          <w:lang w:eastAsia="ru-RU" w:bidi="ar-SA"/>
-        </w:rPr>
+        <w:rPr/>
       </w:r>
       <m:oMathPara xmlns:m="http://schemas.openxmlformats.org/officeDocument/2006/math">
         <m:oMathParaPr>
@@ -1887,6 +1844,10 @@
                     <m:t xml:space="preserve">t</m:t>
                   </m:r>
                   <m:r>
+                    <m:rPr>
+                      <m:lit/>
+                      <m:nor/>
+                    </m:rPr>
                     <w:rPr>
                       <w:rFonts w:ascii="Cambria Math" w:hAnsi="Cambria Math"/>
                     </w:rPr>
@@ -1903,6 +1864,10 @@
             </m:sub>
           </m:sSub>
           <m:r>
+            <m:rPr>
+              <m:lit/>
+              <m:nor/>
+            </m:rPr>
             <w:rPr>
               <w:rFonts w:ascii="Cambria Math" w:hAnsi="Cambria Math"/>
             </w:rPr>
@@ -1927,6 +1892,10 @@
             </m:sub>
           </m:sSub>
           <m:r>
+            <m:rPr>
+              <m:lit/>
+              <m:nor/>
+            </m:rPr>
             <w:rPr>
               <w:rFonts w:ascii="Cambria Math" w:hAnsi="Cambria Math"/>
             </w:rPr>
@@ -1977,37 +1946,7 @@
           <w:szCs w:val="28"/>
           <w:lang w:eastAsia="ru-RU" w:bidi="ar-SA"/>
         </w:rPr>
-        <w:t>Где п</w:t>
-      </w:r>
-      <w:r>
-        <w:rPr>
-          <w:b w:val="false"/>
-          <w:bCs w:val="false"/>
-          <w:color w:val="auto"/>
-          <w:szCs w:val="28"/>
-          <w:lang w:eastAsia="ru-RU" w:bidi="ar-SA"/>
-        </w:rPr>
-        <w:t xml:space="preserve">араметр μ (momentum) определяет вклад предыдущего направления, </w:t>
-      </w:r>
-      <w:r>
-        <w:rPr>
-          <w:b w:val="false"/>
-          <w:bCs w:val="false"/>
-          <w:color w:val="auto"/>
-          <w:szCs w:val="28"/>
-          <w:lang w:eastAsia="ru-RU" w:bidi="ar-SA"/>
-        </w:rPr>
-        <w:t xml:space="preserve">а </w:t>
-      </w:r>
-      <w:r>
-        <w:rPr>
-          <w:b w:val="false"/>
-          <w:bCs w:val="false"/>
-          <w:color w:val="auto"/>
-          <w:szCs w:val="28"/>
-          <w:lang w:eastAsia="ru-RU" w:bidi="ar-SA"/>
-        </w:rPr>
-        <w:t>vt​ - накопленная скорость на текущем шаге. Она хранит экспоненциально затухающее среднее предыдущих градиентов.</w:t>
+        <w:t>Где параметр μ (momentum) определяет вклад предыдущего направления, а vt​ - накопленная скорость на текущем шаге. Она хранит экспоненциально затухающее среднее предыдущих градиентов.</w:t>
       </w:r>
     </w:p>
     <w:p>
@@ -2040,27 +1979,20 @@
           <w:ilvl w:val="0"/>
           <w:numId w:val="4"/>
         </w:numPr>
-        <w:rPr>
-          <w:color w:val="auto"/>
-          <w:szCs w:val="28"/>
-          <w:lang w:eastAsia="ru-RU" w:bidi="ar-SA"/>
-        </w:rPr>
-      </w:pPr>
-      <w:r>
-        <w:rPr>
-          <w:color w:val="auto"/>
-          <w:szCs w:val="28"/>
-          <w:lang w:eastAsia="ru-RU" w:bidi="ar-SA"/>
-        </w:rPr>
-        <w:t>learning rate (</w:t>
-      </w:r>
-      <w:r>
-        <w:rPr>
-          <w:color w:val="auto"/>
-          <w:szCs w:val="28"/>
-          <w:lang w:eastAsia="ru-RU" w:bidi="ar-SA"/>
-        </w:rPr>
-        <w:t>о</w:t>
+        <w:ind w:hanging="360" w:left="720" w:right="0"/>
+        <w:rPr>
+          <w:color w:val="auto"/>
+          <w:szCs w:val="28"/>
+          <w:lang w:eastAsia="ru-RU" w:bidi="ar-SA"/>
+        </w:rPr>
+      </w:pPr>
+      <w:r>
+        <w:rPr>
+          <w:color w:val="auto"/>
+          <w:szCs w:val="28"/>
+          <w:lang w:eastAsia="ru-RU" w:bidi="ar-SA"/>
+        </w:rPr>
+        <w:t>learning rate (о</w:t>
       </w:r>
       <w:r>
         <w:rPr/>
@@ -2082,27 +2014,20 @@
           <w:ilvl w:val="0"/>
           <w:numId w:val="4"/>
         </w:numPr>
-        <w:rPr>
-          <w:color w:val="auto"/>
-          <w:szCs w:val="28"/>
-          <w:lang w:eastAsia="ru-RU" w:bidi="ar-SA"/>
-        </w:rPr>
-      </w:pPr>
-      <w:r>
-        <w:rPr>
-          <w:color w:val="auto"/>
-          <w:szCs w:val="28"/>
-          <w:lang w:eastAsia="ru-RU" w:bidi="ar-SA"/>
-        </w:rPr>
-        <w:t xml:space="preserve">momentum </w:t>
-      </w:r>
-      <w:r>
-        <w:rPr>
-          <w:color w:val="auto"/>
-          <w:szCs w:val="28"/>
-          <w:lang w:eastAsia="ru-RU" w:bidi="ar-SA"/>
-        </w:rPr>
-        <w:t>(</w:t>
+        <w:ind w:hanging="360" w:left="720" w:right="0"/>
+        <w:rPr>
+          <w:color w:val="auto"/>
+          <w:szCs w:val="28"/>
+          <w:lang w:eastAsia="ru-RU" w:bidi="ar-SA"/>
+        </w:rPr>
+      </w:pPr>
+      <w:r>
+        <w:rPr>
+          <w:color w:val="auto"/>
+          <w:szCs w:val="28"/>
+          <w:lang w:eastAsia="ru-RU" w:bidi="ar-SA"/>
+        </w:rPr>
+        <w:t>momentum (</w:t>
       </w:r>
       <w:r>
         <w:rPr/>
@@ -2114,15 +2039,7 @@
           <w:szCs w:val="28"/>
           <w:lang w:eastAsia="ru-RU" w:bidi="ar-SA"/>
         </w:rPr>
-        <w:t>)</w:t>
-      </w:r>
-      <w:r>
-        <w:rPr>
-          <w:color w:val="auto"/>
-          <w:szCs w:val="28"/>
-          <w:lang w:eastAsia="ru-RU" w:bidi="ar-SA"/>
-        </w:rPr>
-        <w:t>: 0.0, 0.5, 0.9, 0.99 (при фиксированном lr=0.01).</w:t>
+        <w:t>): 0.0, 0.5, 0.9, 0.99 (при фиксированном lr=0.01).</w:t>
       </w:r>
     </w:p>
     <w:p>
@@ -2132,7 +2049,7 @@
           <w:ilvl w:val="0"/>
           <w:numId w:val="0"/>
         </w:numPr>
-        <w:ind w:hanging="0" w:left="0"/>
+        <w:ind w:hanging="0" w:left="0" w:right="0"/>
         <w:jc w:val="left"/>
         <w:rPr>
           <w:color w:val="auto"/>
@@ -2146,15 +2063,7 @@
           <w:szCs w:val="28"/>
           <w:lang w:eastAsia="ru-RU" w:bidi="ar-SA"/>
         </w:rPr>
-        <w:t xml:space="preserve">Результаты точности представленны на рисунке </w:t>
-      </w:r>
-      <w:r>
-        <w:rPr>
-          <w:color w:val="auto"/>
-          <w:szCs w:val="28"/>
-          <w:lang w:eastAsia="ru-RU" w:bidi="ar-SA"/>
-        </w:rPr>
-        <w:t>3.</w:t>
+        <w:t>Результаты точности представленны на рисунке 3.</w:t>
       </w:r>
     </w:p>
     <w:p>
@@ -2164,7 +2073,7 @@
           <w:ilvl w:val="0"/>
           <w:numId w:val="0"/>
         </w:numPr>
-        <w:ind w:hanging="0" w:left="0"/>
+        <w:ind w:hanging="0" w:left="0" w:right="0"/>
         <w:jc w:val="center"/>
         <w:rPr>
           <w:color w:val="auto"/>
@@ -2173,11 +2082,7 @@
         </w:rPr>
       </w:pPr>
       <w:r>
-        <w:rPr>
-          <w:color w:val="auto"/>
-          <w:szCs w:val="28"/>
-          <w:lang w:eastAsia="ru-RU" w:bidi="ar-SA"/>
-        </w:rPr>
+        <w:rPr/>
         <w:drawing>
           <wp:inline distT="0" distB="0" distL="0" distR="0">
             <wp:extent cx="6120130" cy="3025775"/>
@@ -2221,7 +2126,7 @@
     <w:p>
       <w:pPr>
         <w:pStyle w:val="Standard"/>
-        <w:ind w:hanging="0" w:left="0"/>
+        <w:ind w:hanging="0" w:left="0" w:right="0"/>
         <w:jc w:val="center"/>
         <w:rPr>
           <w:color w:val="auto"/>
@@ -2235,46 +2140,14 @@
           <w:szCs w:val="28"/>
           <w:lang w:eastAsia="ru-RU" w:bidi="ar-SA"/>
         </w:rPr>
-        <w:t xml:space="preserve">Рисунок </w:t>
-      </w:r>
-      <w:r>
-        <w:rPr>
-          <w:color w:val="auto"/>
-          <w:szCs w:val="28"/>
-          <w:lang w:eastAsia="ru-RU" w:bidi="ar-SA"/>
-        </w:rPr>
-        <w:t>3</w:t>
-      </w:r>
-      <w:r>
-        <w:rPr>
-          <w:color w:val="auto"/>
-          <w:szCs w:val="28"/>
-          <w:lang w:eastAsia="ru-RU" w:bidi="ar-SA"/>
-        </w:rPr>
-        <w:t xml:space="preserve">. Точность модели с </w:t>
-      </w:r>
-      <w:r>
-        <w:rPr>
-          <w:color w:val="auto"/>
-          <w:szCs w:val="28"/>
-          <w:lang w:eastAsia="ru-RU" w:bidi="ar-SA"/>
-        </w:rPr>
-        <w:t xml:space="preserve">SGD </w:t>
-      </w:r>
-      <w:r>
-        <w:rPr>
-          <w:color w:val="auto"/>
-          <w:szCs w:val="28"/>
-          <w:lang w:eastAsia="ru-RU" w:bidi="ar-SA"/>
-        </w:rPr>
-        <w:t>при различных гипперпараметрах.</w:t>
+        <w:t>Рисунок 3. Точность модели с SGD при различных гипперпараметрах.</w:t>
         <w:tab/>
       </w:r>
     </w:p>
     <w:p>
       <w:pPr>
         <w:pStyle w:val="Standard"/>
-        <w:ind w:hanging="0" w:left="0"/>
+        <w:ind w:hanging="0" w:left="0" w:right="0"/>
         <w:jc w:val="left"/>
         <w:rPr>
           <w:color w:val="auto"/>
@@ -2296,29 +2169,13 @@
           <w:szCs w:val="28"/>
           <w:lang w:eastAsia="ru-RU" w:bidi="ar-SA"/>
         </w:rPr>
-        <w:t>Скорость обучения 0.1 да</w:t>
-      </w:r>
-      <w:r>
-        <w:rPr>
-          <w:color w:val="auto"/>
-          <w:szCs w:val="28"/>
-          <w:lang w:eastAsia="ru-RU" w:bidi="ar-SA"/>
-        </w:rPr>
-        <w:t>е</w:t>
-      </w:r>
-      <w:r>
-        <w:rPr>
-          <w:color w:val="auto"/>
-          <w:szCs w:val="28"/>
-          <w:lang w:eastAsia="ru-RU" w:bidi="ar-SA"/>
-        </w:rPr>
-        <w:t>т наилучший результат среди исследованных значений, но при этом шаг может быть слишком большим, что иногда приводит к расходимости (в паре с высоким моментом позже это подтвердилось).</w:t>
-      </w:r>
-    </w:p>
-    <w:p>
-      <w:pPr>
-        <w:pStyle w:val="Standard"/>
-        <w:ind w:hanging="0" w:left="0"/>
+        <w:t>Скорость обучения 0.1 дает наилучший результат среди исследованных значений, но при этом шаг может быть слишком большим, что иногда приводит к расходимости (в паре с высоким моментом позже это подтвердилось).</w:t>
+      </w:r>
+    </w:p>
+    <w:p>
+      <w:pPr>
+        <w:pStyle w:val="Standard"/>
+        <w:ind w:hanging="0" w:left="0" w:right="0"/>
         <w:jc w:val="left"/>
         <w:rPr>
           <w:color w:val="auto"/>
@@ -2346,7 +2203,7 @@
     <w:p>
       <w:pPr>
         <w:pStyle w:val="Standard"/>
-        <w:ind w:hanging="0" w:left="0"/>
+        <w:ind w:hanging="0" w:left="0" w:right="0"/>
         <w:jc w:val="left"/>
         <w:rPr>
           <w:color w:val="auto"/>
@@ -2368,29 +2225,13 @@
           <w:szCs w:val="28"/>
           <w:lang w:eastAsia="ru-RU" w:bidi="ar-SA"/>
         </w:rPr>
-        <w:t>Увеличение момента значительно улучшает сходимость, особенно μ=0.99 да</w:t>
-      </w:r>
-      <w:r>
-        <w:rPr>
-          <w:color w:val="auto"/>
-          <w:szCs w:val="28"/>
-          <w:lang w:eastAsia="ru-RU" w:bidi="ar-SA"/>
-        </w:rPr>
-        <w:t>е</w:t>
-      </w:r>
-      <w:r>
-        <w:rPr>
-          <w:color w:val="auto"/>
-          <w:szCs w:val="28"/>
-          <w:lang w:eastAsia="ru-RU" w:bidi="ar-SA"/>
-        </w:rPr>
-        <w:t>т почти 98% точности. Момент помогает накапливать инерцию и быстрее преодолевать локальные минимумы и пологие участки.</w:t>
-      </w:r>
-    </w:p>
-    <w:p>
-      <w:pPr>
-        <w:pStyle w:val="Standard"/>
-        <w:ind w:hanging="0" w:left="0"/>
+        <w:t>Увеличение момента значительно улучшает сходимость, особенно μ=0.99 дает почти 98% точности. Момент помогает накапливать инерцию и быстрее преодолевать локальные минимумы и пологие участки.</w:t>
+      </w:r>
+    </w:p>
+    <w:p>
+      <w:pPr>
+        <w:pStyle w:val="Standard"/>
+        <w:ind w:hanging="0" w:left="0" w:right="0"/>
         <w:jc w:val="left"/>
         <w:rPr>
           <w:color w:val="auto"/>
@@ -2409,7 +2250,7 @@
     <w:p>
       <w:pPr>
         <w:pStyle w:val="Standard"/>
-        <w:ind w:hanging="0" w:left="0"/>
+        <w:ind w:hanging="0" w:left="0" w:right="0"/>
         <w:jc w:val="left"/>
         <w:rPr>
           <w:b/>
@@ -2434,7 +2275,7 @@
     <w:p>
       <w:pPr>
         <w:pStyle w:val="Standard"/>
-        <w:ind w:hanging="0" w:left="0"/>
+        <w:ind w:hanging="0" w:left="0" w:right="0"/>
         <w:jc w:val="left"/>
         <w:rPr/>
       </w:pPr>
@@ -2446,17 +2287,7 @@
           <w:szCs w:val="28"/>
           <w:lang w:eastAsia="ru-RU" w:bidi="ar-SA"/>
         </w:rPr>
-        <w:t>Алгоритм</w:t>
-      </w:r>
-      <w:r>
-        <w:rPr>
-          <w:b w:val="false"/>
-          <w:bCs w:val="false"/>
-          <w:color w:val="auto"/>
-          <w:szCs w:val="28"/>
-          <w:lang w:eastAsia="ru-RU" w:bidi="ar-SA"/>
-        </w:rPr>
-        <w:t xml:space="preserve"> сочетает идеи момента и адаптивной подстройки скорости обучения для каждого параметра. Он хранит скользящие средние градиента (первый момент) и квадрата градиента (второй момент) и использует их для адаптивного шага. </w:t>
+        <w:t xml:space="preserve">Алгоритм сочетает идеи момента и адаптивной подстройки скорости обучения для каждого параметра. Он хранит скользящие средние градиента (первый момент) и квадрата градиента (второй момент) и использует их для адаптивного шага. </w:t>
       </w:r>
       <w:r>
         <w:rPr/>
@@ -2480,15 +2311,7 @@
           <w:szCs w:val="28"/>
           <w:lang w:eastAsia="ru-RU" w:bidi="ar-SA"/>
         </w:rPr>
-        <w:t>beta_</w:t>
-      </w:r>
-      <w:r>
-        <w:rPr>
-          <w:color w:val="auto"/>
-          <w:szCs w:val="28"/>
-          <w:lang w:eastAsia="ru-RU" w:bidi="ar-SA"/>
-        </w:rPr>
-        <w:t xml:space="preserve">2 </w:t>
+        <w:t xml:space="preserve">beta_2 </w:t>
       </w:r>
       <w:r>
         <w:rPr/>
@@ -2512,15 +2335,7 @@
           <w:szCs w:val="28"/>
           <w:lang w:eastAsia="ru-RU" w:bidi="ar-SA"/>
         </w:rPr>
-        <w:t>beta_</w:t>
-      </w:r>
-      <w:r>
-        <w:rPr>
-          <w:color w:val="auto"/>
-          <w:szCs w:val="28"/>
-          <w:lang w:eastAsia="ru-RU" w:bidi="ar-SA"/>
-        </w:rPr>
-        <w:t>2</w:t>
+        <w:t>beta_2</w:t>
       </w:r>
       <w:r>
         <w:rPr/>
@@ -2530,7 +2345,7 @@
     <w:p>
       <w:pPr>
         <w:pStyle w:val="Standard"/>
-        <w:ind w:hanging="0" w:left="0"/>
+        <w:ind w:hanging="0" w:left="0" w:right="0"/>
         <w:jc w:val="left"/>
         <w:rPr>
           <w:color w:val="auto"/>
@@ -2554,6 +2369,7 @@
           <w:ilvl w:val="0"/>
           <w:numId w:val="5"/>
         </w:numPr>
+        <w:ind w:hanging="360" w:left="720" w:right="0"/>
         <w:jc w:val="left"/>
         <w:rPr>
           <w:color w:val="auto"/>
@@ -2577,6 +2393,7 @@
           <w:ilvl w:val="0"/>
           <w:numId w:val="5"/>
         </w:numPr>
+        <w:ind w:hanging="360" w:left="720" w:right="0"/>
         <w:jc w:val="left"/>
         <w:rPr>
           <w:color w:val="auto"/>
@@ -2600,6 +2417,7 @@
           <w:ilvl w:val="0"/>
           <w:numId w:val="5"/>
         </w:numPr>
+        <w:ind w:hanging="360" w:left="720" w:right="0"/>
         <w:jc w:val="left"/>
         <w:rPr>
           <w:color w:val="auto"/>
@@ -2623,7 +2441,7 @@
           <w:ilvl w:val="0"/>
           <w:numId w:val="0"/>
         </w:numPr>
-        <w:ind w:hanging="0" w:left="0"/>
+        <w:ind w:hanging="0" w:left="0" w:right="0"/>
         <w:jc w:val="left"/>
         <w:rPr>
           <w:color w:val="auto"/>
@@ -2637,23 +2455,7 @@
           <w:szCs w:val="28"/>
           <w:lang w:eastAsia="ru-RU" w:bidi="ar-SA"/>
         </w:rPr>
-        <w:t xml:space="preserve">Результаты точности представленны на рисунке </w:t>
-      </w:r>
-      <w:r>
-        <w:rPr>
-          <w:color w:val="auto"/>
-          <w:szCs w:val="28"/>
-          <w:lang w:eastAsia="ru-RU" w:bidi="ar-SA"/>
-        </w:rPr>
-        <w:t>4</w:t>
-      </w:r>
-      <w:r>
-        <w:rPr>
-          <w:color w:val="auto"/>
-          <w:szCs w:val="28"/>
-          <w:lang w:eastAsia="ru-RU" w:bidi="ar-SA"/>
-        </w:rPr>
-        <w:t>.</w:t>
+        <w:t>Результаты точности представленны на рисунке 4.</w:t>
       </w:r>
     </w:p>
     <w:p>
@@ -2663,7 +2465,7 @@
           <w:ilvl w:val="0"/>
           <w:numId w:val="0"/>
         </w:numPr>
-        <w:ind w:hanging="0" w:left="0"/>
+        <w:ind w:hanging="0" w:left="0" w:right="0"/>
         <w:jc w:val="left"/>
         <w:rPr>
           <w:color w:val="auto"/>
@@ -2672,11 +2474,7 @@
         </w:rPr>
       </w:pPr>
       <w:r>
-        <w:rPr>
-          <w:color w:val="auto"/>
-          <w:szCs w:val="28"/>
-          <w:lang w:eastAsia="ru-RU" w:bidi="ar-SA"/>
-        </w:rPr>
+        <w:rPr/>
         <w:drawing>
           <wp:inline distT="0" distB="0" distL="0" distR="0">
             <wp:extent cx="6120130" cy="3032125"/>
@@ -2720,7 +2518,7 @@
     <w:p>
       <w:pPr>
         <w:pStyle w:val="Standard"/>
-        <w:ind w:hanging="0" w:left="0"/>
+        <w:ind w:hanging="0" w:left="0" w:right="0"/>
         <w:jc w:val="center"/>
         <w:rPr>
           <w:color w:val="auto"/>
@@ -2734,39 +2532,7 @@
           <w:szCs w:val="28"/>
           <w:lang w:eastAsia="ru-RU" w:bidi="ar-SA"/>
         </w:rPr>
-        <w:t xml:space="preserve">Рисунок </w:t>
-      </w:r>
-      <w:r>
-        <w:rPr>
-          <w:color w:val="auto"/>
-          <w:szCs w:val="28"/>
-          <w:lang w:eastAsia="ru-RU" w:bidi="ar-SA"/>
-        </w:rPr>
-        <w:t>4</w:t>
-      </w:r>
-      <w:r>
-        <w:rPr>
-          <w:color w:val="auto"/>
-          <w:szCs w:val="28"/>
-          <w:lang w:eastAsia="ru-RU" w:bidi="ar-SA"/>
-        </w:rPr>
-        <w:t xml:space="preserve">. Точность модели с </w:t>
-      </w:r>
-      <w:r>
-        <w:rPr>
-          <w:color w:val="auto"/>
-          <w:szCs w:val="28"/>
-          <w:lang w:eastAsia="ru-RU" w:bidi="ar-SA"/>
-        </w:rPr>
-        <w:t xml:space="preserve">Adam </w:t>
-      </w:r>
-      <w:r>
-        <w:rPr>
-          <w:color w:val="auto"/>
-          <w:szCs w:val="28"/>
-          <w:lang w:eastAsia="ru-RU" w:bidi="ar-SA"/>
-        </w:rPr>
-        <w:t>при различных гипперпараметрах.</w:t>
+        <w:t>Рисунок 4. Точность модели с Adam при различных гипперпараметрах.</w:t>
       </w:r>
     </w:p>
     <w:p>
@@ -2879,17 +2645,7 @@
           <w:lang w:eastAsia="ru-RU" w:bidi="ar-SA"/>
         </w:rPr>
         <w:tab/>
-        <w:t>Параметр beta_</w:t>
-      </w:r>
-      <w:r>
-        <w:rPr>
-          <w:rFonts w:eastAsia="Times New Roman" w:cs="Times New Roman" w:ascii="Times New Roman" w:hAnsi="Times New Roman"/>
-          <w:color w:val="auto"/>
-          <w:sz w:val="28"/>
-          <w:szCs w:val="28"/>
-          <w:lang w:eastAsia="ru-RU" w:bidi="ar-SA"/>
-        </w:rPr>
-        <w:t>2</w:t>
+        <w:t>Параметр beta_2</w:t>
       </w:r>
       <w:r>
         <w:rPr>
@@ -2926,7 +2682,7 @@
     <w:p>
       <w:pPr>
         <w:pStyle w:val="Standard"/>
-        <w:ind w:hanging="0" w:left="0"/>
+        <w:ind w:hanging="0" w:left="0" w:right="0"/>
         <w:jc w:val="left"/>
         <w:rPr>
           <w:color w:val="auto"/>
@@ -2946,7 +2702,7 @@
       <w:pPr>
         <w:pStyle w:val="Standard"/>
         <w:bidi w:val="0"/>
-        <w:ind w:hanging="0" w:left="0"/>
+        <w:ind w:hanging="0" w:left="0" w:right="0"/>
         <w:jc w:val="left"/>
         <w:rPr>
           <w:b/>
@@ -2972,7 +2728,7 @@
       <w:pPr>
         <w:pStyle w:val="Standard"/>
         <w:bidi w:val="0"/>
-        <w:ind w:hanging="0" w:left="0"/>
+        <w:ind w:hanging="0" w:left="0" w:right="0"/>
         <w:jc w:val="left"/>
         <w:rPr/>
       </w:pPr>
@@ -2984,27 +2740,7 @@
           <w:szCs w:val="28"/>
           <w:lang w:eastAsia="ru-RU" w:bidi="ar-SA"/>
         </w:rPr>
-        <w:t>RMSprop (Root Mean Square Propagation) адаптирует скорость обучения для каждого параметра, деля е</w:t>
-      </w:r>
-      <w:r>
-        <w:rPr>
-          <w:b w:val="false"/>
-          <w:bCs w:val="false"/>
-          <w:color w:val="auto"/>
-          <w:szCs w:val="28"/>
-          <w:lang w:eastAsia="ru-RU" w:bidi="ar-SA"/>
-        </w:rPr>
-        <w:t>е</w:t>
-      </w:r>
-      <w:r>
-        <w:rPr>
-          <w:b w:val="false"/>
-          <w:bCs w:val="false"/>
-          <w:color w:val="auto"/>
-          <w:szCs w:val="28"/>
-          <w:lang w:eastAsia="ru-RU" w:bidi="ar-SA"/>
-        </w:rPr>
-        <w:t xml:space="preserve"> на скользящее среднее квадратов градиентов. Это помогает бороться с затуханием градиента и ускоряет сходимость. </w:t>
+        <w:t xml:space="preserve">RMSprop (Root Mean Square Propagation) адаптирует скорость обучения для каждого параметра, деля ее на скользящее среднее квадратов градиентов. Это помогает бороться с затуханием градиента и ускоряет сходимость. </w:t>
       </w:r>
       <w:r>
         <w:rPr/>
@@ -3015,7 +2751,7 @@
       <w:pPr>
         <w:pStyle w:val="Standard"/>
         <w:bidi w:val="0"/>
-        <w:ind w:hanging="0" w:left="0"/>
+        <w:ind w:hanging="0" w:left="0" w:right="0"/>
         <w:jc w:val="left"/>
         <w:rPr>
           <w:color w:val="auto"/>
@@ -3040,6 +2776,7 @@
           <w:numId w:val="6"/>
         </w:numPr>
         <w:bidi w:val="0"/>
+        <w:ind w:hanging="360" w:left="720" w:right="0"/>
         <w:jc w:val="left"/>
         <w:rPr>
           <w:color w:val="auto"/>
@@ -3064,6 +2801,7 @@
           <w:numId w:val="6"/>
         </w:numPr>
         <w:bidi w:val="0"/>
+        <w:ind w:hanging="360" w:left="720" w:right="0"/>
         <w:jc w:val="left"/>
         <w:rPr>
           <w:color w:val="auto"/>
@@ -3088,6 +2826,7 @@
           <w:numId w:val="6"/>
         </w:numPr>
         <w:bidi w:val="0"/>
+        <w:ind w:hanging="360" w:left="720" w:right="0"/>
         <w:jc w:val="left"/>
         <w:rPr>
           <w:color w:val="auto"/>
@@ -3111,7 +2850,7 @@
           <w:ilvl w:val="0"/>
           <w:numId w:val="0"/>
         </w:numPr>
-        <w:ind w:hanging="0" w:left="0"/>
+        <w:ind w:hanging="0" w:left="0" w:right="0"/>
         <w:jc w:val="left"/>
         <w:rPr>
           <w:color w:val="auto"/>
@@ -3125,23 +2864,7 @@
           <w:szCs w:val="28"/>
           <w:lang w:eastAsia="ru-RU" w:bidi="ar-SA"/>
         </w:rPr>
-        <w:t xml:space="preserve">Результаты точности представленны на рисунке </w:t>
-      </w:r>
-      <w:r>
-        <w:rPr>
-          <w:color w:val="auto"/>
-          <w:szCs w:val="28"/>
-          <w:lang w:eastAsia="ru-RU" w:bidi="ar-SA"/>
-        </w:rPr>
-        <w:t>5</w:t>
-      </w:r>
-      <w:r>
-        <w:rPr>
-          <w:color w:val="auto"/>
-          <w:szCs w:val="28"/>
-          <w:lang w:eastAsia="ru-RU" w:bidi="ar-SA"/>
-        </w:rPr>
-        <w:t>.</w:t>
+        <w:t>Результаты точности представленны на рисунке 5.</w:t>
       </w:r>
     </w:p>
     <w:p>
@@ -3151,7 +2874,7 @@
           <w:ilvl w:val="0"/>
           <w:numId w:val="0"/>
         </w:numPr>
-        <w:ind w:hanging="0" w:left="0"/>
+        <w:ind w:hanging="0" w:left="0" w:right="0"/>
         <w:jc w:val="left"/>
         <w:rPr>
           <w:color w:val="auto"/>
@@ -3160,11 +2883,7 @@
         </w:rPr>
       </w:pPr>
       <w:r>
-        <w:rPr>
-          <w:color w:val="auto"/>
-          <w:szCs w:val="28"/>
-          <w:lang w:eastAsia="ru-RU" w:bidi="ar-SA"/>
-        </w:rPr>
+        <w:rPr/>
         <w:drawing>
           <wp:inline distT="0" distB="0" distL="0" distR="0">
             <wp:extent cx="6120130" cy="3025775"/>
@@ -3212,7 +2931,7 @@
           <w:ilvl w:val="0"/>
           <w:numId w:val="0"/>
         </w:numPr>
-        <w:ind w:hanging="0" w:left="0"/>
+        <w:ind w:hanging="0" w:left="0" w:right="0"/>
         <w:jc w:val="center"/>
         <w:rPr>
           <w:color w:val="auto"/>
@@ -3226,39 +2945,7 @@
           <w:szCs w:val="28"/>
           <w:lang w:eastAsia="ru-RU" w:bidi="ar-SA"/>
         </w:rPr>
-        <w:t xml:space="preserve">Рисунок </w:t>
-      </w:r>
-      <w:r>
-        <w:rPr>
-          <w:color w:val="auto"/>
-          <w:szCs w:val="28"/>
-          <w:lang w:eastAsia="ru-RU" w:bidi="ar-SA"/>
-        </w:rPr>
-        <w:t>5</w:t>
-      </w:r>
-      <w:r>
-        <w:rPr>
-          <w:color w:val="auto"/>
-          <w:szCs w:val="28"/>
-          <w:lang w:eastAsia="ru-RU" w:bidi="ar-SA"/>
-        </w:rPr>
-        <w:t>. Точность модели с RMSprop</w:t>
-      </w:r>
-      <w:r>
-        <w:rPr>
-          <w:color w:val="auto"/>
-          <w:szCs w:val="28"/>
-          <w:lang w:eastAsia="ru-RU" w:bidi="ar-SA"/>
-        </w:rPr>
-        <w:t xml:space="preserve"> </w:t>
-      </w:r>
-      <w:r>
-        <w:rPr>
-          <w:color w:val="auto"/>
-          <w:szCs w:val="28"/>
-          <w:lang w:eastAsia="ru-RU" w:bidi="ar-SA"/>
-        </w:rPr>
-        <w:t>при различных гипперпараметрах.</w:t>
+        <w:t>Рисунок 5. Точность модели с RMSprop при различных гипперпараметрах.</w:t>
       </w:r>
     </w:p>
     <w:p>
@@ -3298,23 +2985,7 @@
           <w:lang w:eastAsia="ru-RU" w:bidi="ar-SA"/>
         </w:rPr>
         <w:tab/>
-        <w:t xml:space="preserve">Параметр </w:t>
-      </w:r>
-      <w:r>
-        <w:rPr>
-          <w:color w:val="auto"/>
-          <w:szCs w:val="28"/>
-          <w:lang w:eastAsia="ru-RU" w:bidi="ar-SA"/>
-        </w:rPr>
-        <w:t>rho</w:t>
-      </w:r>
-      <w:r>
-        <w:rPr>
-          <w:color w:val="auto"/>
-          <w:szCs w:val="28"/>
-          <w:lang w:eastAsia="ru-RU" w:bidi="ar-SA"/>
-        </w:rPr>
-        <w:t xml:space="preserve"> оптимален при 0.95, что близко к стандартному 0.9</w:t>
+        <w:t>Параметр rho оптимален при 0.95, что близко к стандартному 0.9</w:t>
       </w:r>
     </w:p>
     <w:p>
@@ -3412,6 +3083,7 @@
           <w:ilvl w:val="0"/>
           <w:numId w:val="7"/>
         </w:numPr>
+        <w:ind w:hanging="360" w:left="720" w:right="0"/>
         <w:jc w:val="left"/>
         <w:rPr>
           <w:b w:val="false"/>
@@ -3439,6 +3111,7 @@
           <w:ilvl w:val="0"/>
           <w:numId w:val="7"/>
         </w:numPr>
+        <w:ind w:hanging="360" w:left="720" w:right="0"/>
         <w:jc w:val="left"/>
         <w:rPr>
           <w:b w:val="false"/>
@@ -3466,6 +3139,7 @@
           <w:ilvl w:val="0"/>
           <w:numId w:val="7"/>
         </w:numPr>
+        <w:ind w:hanging="360" w:left="720" w:right="0"/>
         <w:jc w:val="left"/>
         <w:rPr>
           <w:b w:val="false"/>
@@ -3525,13 +3199,7 @@
         </w:rPr>
       </w:pPr>
       <w:r>
-        <w:rPr>
-          <w:b w:val="false"/>
-          <w:bCs w:val="false"/>
-          <w:color w:val="auto"/>
-          <w:szCs w:val="28"/>
-          <w:lang w:eastAsia="ru-RU" w:bidi="ar-SA"/>
-        </w:rPr>
+        <w:rPr/>
         <w:drawing>
           <wp:inline distT="0" distB="0" distL="0" distR="0">
             <wp:extent cx="6120130" cy="3032125"/>
@@ -3586,48 +3254,13 @@
           <w:szCs w:val="28"/>
           <w:lang w:eastAsia="ru-RU" w:bidi="ar-SA"/>
         </w:rPr>
-        <w:t xml:space="preserve">Рисунок </w:t>
-      </w:r>
-      <w:r>
-        <w:rPr>
-          <w:szCs w:val="28"/>
-          <w:lang w:eastAsia="ru-RU" w:bidi="ar-SA"/>
-        </w:rPr>
-        <w:t>6</w:t>
-      </w:r>
-      <w:r>
-        <w:rPr>
-          <w:szCs w:val="28"/>
-          <w:lang w:eastAsia="ru-RU" w:bidi="ar-SA"/>
-        </w:rPr>
-        <w:t xml:space="preserve">.  График </w:t>
-      </w:r>
-      <w:r>
-        <w:rPr>
-          <w:szCs w:val="28"/>
-          <w:lang w:eastAsia="ru-RU" w:bidi="ar-SA"/>
-        </w:rPr>
-        <w:t>точности</w:t>
-      </w:r>
-      <w:r>
-        <w:rPr>
-          <w:szCs w:val="28"/>
-          <w:lang w:eastAsia="ru-RU" w:bidi="ar-SA"/>
-        </w:rPr>
-        <w:t xml:space="preserve"> </w:t>
-      </w:r>
-      <w:r>
-        <w:rPr>
-          <w:szCs w:val="28"/>
-          <w:lang w:eastAsia="ru-RU" w:bidi="ar-SA"/>
-        </w:rPr>
-        <w:t>для различных оптимизаторов.</w:t>
-      </w:r>
-    </w:p>
-    <w:p>
-      <w:pPr>
-        <w:pStyle w:val="Standard"/>
-        <w:ind w:hanging="0" w:left="0"/>
+        <w:t>Рисунок 6.  График точности для различных оптимизаторов.</w:t>
+      </w:r>
+    </w:p>
+    <w:p>
+      <w:pPr>
+        <w:pStyle w:val="Standard"/>
+        <w:ind w:hanging="0" w:left="0" w:right="0"/>
         <w:jc w:val="center"/>
         <w:rPr>
           <w:szCs w:val="28"/>
@@ -3635,10 +3268,7 @@
         </w:rPr>
       </w:pPr>
       <w:r>
-        <w:rPr>
-          <w:szCs w:val="28"/>
-          <w:lang w:eastAsia="ru-RU" w:bidi="ar-SA"/>
-        </w:rPr>
+        <w:rPr/>
         <w:drawing>
           <wp:inline distT="0" distB="0" distL="0" distR="0">
             <wp:extent cx="6120130" cy="3956685"/>
@@ -3690,40 +3320,21 @@
       </w:pPr>
       <w:r>
         <w:rPr/>
-        <w:t xml:space="preserve">Рисунок </w:t>
-      </w:r>
+        <w:t>Рисунок 7.  График потерь в ходе обучения для различных оптимизаторов.</w:t>
+      </w:r>
+    </w:p>
+    <w:p>
+      <w:pPr>
+        <w:pStyle w:val="Standard"/>
+        <w:ind w:hanging="0" w:left="0" w:right="0"/>
+        <w:jc w:val="center"/>
+        <w:rPr>
+          <w:szCs w:val="28"/>
+          <w:lang w:eastAsia="ru-RU" w:bidi="ar-SA"/>
+        </w:rPr>
+      </w:pPr>
       <w:r>
         <w:rPr/>
-        <w:t>7</w:t>
-      </w:r>
-      <w:r>
-        <w:rPr/>
-        <w:t xml:space="preserve">.  График </w:t>
-      </w:r>
-      <w:r>
-        <w:rPr/>
-        <w:t xml:space="preserve">потерь в ходе обучения </w:t>
-      </w:r>
-      <w:r>
-        <w:rPr/>
-        <w:t>для различных оптимизаторов.</w:t>
-      </w:r>
-    </w:p>
-    <w:p>
-      <w:pPr>
-        <w:pStyle w:val="Standard"/>
-        <w:ind w:hanging="0" w:left="0"/>
-        <w:jc w:val="center"/>
-        <w:rPr>
-          <w:szCs w:val="28"/>
-          <w:lang w:eastAsia="ru-RU" w:bidi="ar-SA"/>
-        </w:rPr>
-      </w:pPr>
-      <w:r>
-        <w:rPr>
-          <w:szCs w:val="28"/>
-          <w:lang w:eastAsia="ru-RU" w:bidi="ar-SA"/>
-        </w:rPr>
         <w:drawing>
           <wp:inline distT="0" distB="0" distL="0" distR="0">
             <wp:extent cx="6120130" cy="3878580"/>
@@ -3775,23 +3386,7 @@
       </w:pPr>
       <w:r>
         <w:rPr/>
-        <w:t xml:space="preserve">Рисунок </w:t>
-      </w:r>
-      <w:r>
-        <w:rPr/>
-        <w:t>8</w:t>
-      </w:r>
-      <w:r>
-        <w:rPr/>
-        <w:t xml:space="preserve">.  График </w:t>
-      </w:r>
-      <w:r>
-        <w:rPr/>
-        <w:t>точности</w:t>
-      </w:r>
-      <w:r>
-        <w:rPr/>
-        <w:t xml:space="preserve"> в ходе обучения для различных оптимизаторов.</w:t>
+        <w:t>Рисунок 8.  График точности в ходе обучения для различных оптимизаторов.</w:t>
       </w:r>
     </w:p>
     <w:p>
@@ -3807,31 +3402,7 @@
       </w:r>
       <w:r>
         <w:rPr/>
-        <w:t xml:space="preserve">SGD с комбинацией большого шага (0.1) и высокого момента (0.99) показал нестабильность и низкую итоговую точность. Вероятно, такой большой шаг приводит к </w:t>
-      </w:r>
-      <w:r>
-        <w:rPr/>
-        <w:t xml:space="preserve">пропуску </w:t>
-      </w:r>
-      <w:r>
-        <w:rPr/>
-        <w:t>минимум</w:t>
-      </w:r>
-      <w:r>
-        <w:rPr/>
-        <w:t>а</w:t>
-      </w:r>
-      <w:r>
-        <w:rPr/>
-        <w:t xml:space="preserve">, а высокий момент усугубляет колебания. Это контрастирует с отдельными экспериментами, где по отдельности эти параметры давали хорошие результаты, </w:t>
-      </w:r>
-      <w:r>
-        <w:rPr/>
-        <w:t xml:space="preserve">а </w:t>
-      </w:r>
-      <w:r>
-        <w:rPr/>
-        <w:t>их совместное использование оказалось неудачным.</w:t>
+        <w:t>SGD с комбинацией большого шага (0.1) и высокого момента (0.99) показал нестабильность и низкую итоговую точность. Вероятно, такой большой шаг приводит к пропуску минимума, а высокий момент усугубляет колебания. Это контрастирует с отдельными экспериментами, где по отдельности эти параметры давали хорошие результаты, а их совместное использование оказалось неудачным.</w:t>
       </w:r>
     </w:p>
     <w:p>
@@ -3844,15 +3415,7 @@
       <w:r>
         <w:rPr/>
         <w:tab/>
-        <w:t>Adam и RMSprop показали отличные результаты (около 98%). RMSproof с моментом 0.5 немного превзош</w:t>
-      </w:r>
-      <w:r>
-        <w:rPr/>
-        <w:t>е</w:t>
-      </w:r>
-      <w:r>
-        <w:rPr/>
-        <w:t>л Adam. Оба алгоритма быстро сходятся уже после первой эпохи.</w:t>
+        <w:t>Adam и RMSprop показали отличные результаты (около 98%). RMSproof с моментом 0.5 немного превзошел Adam. Оба алгоритма быстро сходятся уже после первой эпохи.</w:t>
       </w:r>
     </w:p>
     <w:p>
@@ -3934,6 +3497,7 @@
           <w:ilvl w:val="0"/>
           <w:numId w:val="8"/>
         </w:numPr>
+        <w:ind w:hanging="360" w:left="720" w:right="0"/>
         <w:jc w:val="left"/>
         <w:rPr>
           <w:b w:val="false"/>
@@ -3959,6 +3523,7 @@
           <w:ilvl w:val="0"/>
           <w:numId w:val="8"/>
         </w:numPr>
+        <w:ind w:hanging="360" w:left="720" w:right="0"/>
         <w:jc w:val="left"/>
         <w:rPr>
           <w:b w:val="false"/>
@@ -3984,6 +3549,7 @@
           <w:ilvl w:val="0"/>
           <w:numId w:val="8"/>
         </w:numPr>
+        <w:ind w:hanging="360" w:left="720" w:right="0"/>
         <w:jc w:val="left"/>
         <w:rPr>
           <w:b w:val="false"/>
@@ -4009,6 +3575,7 @@
           <w:ilvl w:val="0"/>
           <w:numId w:val="8"/>
         </w:numPr>
+        <w:ind w:hanging="360" w:left="720" w:right="0"/>
         <w:jc w:val="left"/>
         <w:rPr>
           <w:b w:val="false"/>
@@ -4034,6 +3601,7 @@
           <w:ilvl w:val="0"/>
           <w:numId w:val="8"/>
         </w:numPr>
+        <w:ind w:hanging="360" w:left="720" w:right="0"/>
         <w:jc w:val="left"/>
         <w:rPr>
           <w:b w:val="false"/>
@@ -4050,42 +3618,6 @@
           <w:lang w:eastAsia="ru-RU" w:bidi="ar-SA"/>
         </w:rPr>
         <w:t>нормирует значения пикселей к диапазону [0,1] и добавляет размерность пакета.</w:t>
-      </w:r>
-    </w:p>
-    <w:p>
-      <w:pPr>
-        <w:pStyle w:val="Standard"/>
-        <w:numPr>
-          <w:ilvl w:val="0"/>
-          <w:numId w:val="0"/>
-        </w:numPr>
-        <w:ind w:hanging="0" w:left="0"/>
-        <w:jc w:val="left"/>
-        <w:rPr>
-          <w:b w:val="false"/>
-          <w:bCs w:val="false"/>
-          <w:szCs w:val="28"/>
-          <w:lang w:eastAsia="ru-RU" w:bidi="ar-SA"/>
-        </w:rPr>
-      </w:pPr>
-      <w:r>
-        <w:rPr>
-          <w:b w:val="false"/>
-          <w:bCs w:val="false"/>
-          <w:szCs w:val="28"/>
-          <w:lang w:eastAsia="ru-RU" w:bidi="ar-SA"/>
-        </w:rPr>
-        <w:t xml:space="preserve"> </w:t>
-      </w:r>
-      <w:r>
-        <w:rPr>
-          <w:b w:val="false"/>
-          <w:bCs w:val="false"/>
-          <w:szCs w:val="28"/>
-          <w:lang w:eastAsia="ru-RU" w:bidi="ar-SA"/>
-        </w:rPr>
-        <w:tab/>
-        <w:t>Функция predict_user_image принимает модель и путь к изображению, выполняет предсказание и возвращает предсказанный класс и уверенность.</w:t>
       </w:r>
     </w:p>
     <w:p>
@@ -4111,7 +3643,17 @@
           <w:szCs w:val="28"/>
           <w:lang w:eastAsia="ru-RU" w:bidi="ar-SA"/>
         </w:rPr>
-        <w:t>В качестве финальной модели использован RMSprop с параметрами (lr=0.001, rho=0.95, momentum=0.5), обученный на 5 эпохах. На обучающей выборке точность достигла ~99%.</w:t>
+        <w:t xml:space="preserve"> </w:t>
+      </w:r>
+      <w:r>
+        <w:rPr>
+          <w:b w:val="false"/>
+          <w:bCs w:val="false"/>
+          <w:szCs w:val="28"/>
+          <w:lang w:eastAsia="ru-RU" w:bidi="ar-SA"/>
+        </w:rPr>
+        <w:tab/>
+        <w:t>Функция predict_user_image принимает модель и путь к изображению, выполняет предсказание и возвращает предсказанный класс и уверенность.</w:t>
       </w:r>
     </w:p>
     <w:p>
@@ -4137,6 +3679,32 @@
           <w:szCs w:val="28"/>
           <w:lang w:eastAsia="ru-RU" w:bidi="ar-SA"/>
         </w:rPr>
+        <w:t>В качестве финальной модели использован RMSprop с параметрами (lr=0.001, rho=0.95, momentum=0.5), обученный на 5 эпохах. На обучающей выборке точность достигла ~99%.</w:t>
+      </w:r>
+    </w:p>
+    <w:p>
+      <w:pPr>
+        <w:pStyle w:val="Standard"/>
+        <w:numPr>
+          <w:ilvl w:val="0"/>
+          <w:numId w:val="0"/>
+        </w:numPr>
+        <w:ind w:hanging="0" w:left="0" w:right="0"/>
+        <w:jc w:val="left"/>
+        <w:rPr>
+          <w:b w:val="false"/>
+          <w:bCs w:val="false"/>
+          <w:szCs w:val="28"/>
+          <w:lang w:eastAsia="ru-RU" w:bidi="ar-SA"/>
+        </w:rPr>
+      </w:pPr>
+      <w:r>
+        <w:rPr>
+          <w:b w:val="false"/>
+          <w:bCs w:val="false"/>
+          <w:szCs w:val="28"/>
+          <w:lang w:eastAsia="ru-RU" w:bidi="ar-SA"/>
+        </w:rPr>
         <w:tab/>
         <w:t>После загрузки пользовательского файла (скриншот с цифрой 5) модель предсказала класс 5 с уверенностью 0.70. На графиках показаны исходное изображение и его обработанная версия 28×28, что подтверждает корректность предобработки. На рисунке 9 представлен вывод исходного изображения с предсказанием и предобработанного изображения поданного на предсказание модели.</w:t>
       </w:r>
@@ -4158,12 +3726,7 @@
         </w:rPr>
       </w:pPr>
       <w:r>
-        <w:rPr>
-          <w:b w:val="false"/>
-          <w:bCs w:val="false"/>
-          <w:szCs w:val="28"/>
-          <w:lang w:eastAsia="ru-RU" w:bidi="ar-SA"/>
-        </w:rPr>
+        <w:rPr/>
         <w:drawing>
           <wp:inline distT="0" distB="0" distL="0" distR="0">
             <wp:extent cx="5615940" cy="2667000"/>
@@ -4215,19 +3778,7 @@
       </w:pPr>
       <w:r>
         <w:rPr/>
-        <w:t xml:space="preserve">Рисунок </w:t>
-      </w:r>
-      <w:r>
-        <w:rPr/>
-        <w:t>9</w:t>
-      </w:r>
-      <w:r>
-        <w:rPr/>
-        <w:t xml:space="preserve">.  </w:t>
-      </w:r>
-      <w:r>
-        <w:rPr/>
-        <w:t>Обработка пользовательского изображения.</w:t>
+        <w:t>Рисунок 9.  Обработка пользовательского изображения.</w:t>
       </w:r>
     </w:p>
     <w:p>
@@ -4258,23 +3809,7 @@
       <w:r>
         <w:rPr/>
         <w:tab/>
-        <w:t xml:space="preserve">В ходе работы была реализована нейросетевая модель для классификации рукописных цифр MNIST, достигнута точность выше 95% на тестовых данных </w:t>
-      </w:r>
-      <w:r>
-        <w:rPr/>
-        <w:t>(98%)</w:t>
-      </w:r>
-      <w:r>
-        <w:rPr/>
-        <w:t>. Проведено исследование тр</w:t>
-      </w:r>
-      <w:r>
-        <w:rPr/>
-        <w:t>н</w:t>
-      </w:r>
-      <w:r>
-        <w:rPr/>
-        <w:t>х оптимизаторов и их параметров, позволившее подобрать наилучшие настройки. Лучший результат (98%) показал оптимизатор RMSprop с параметрами lr=0.001, rho=0.95, momentum=0.5. Разработана функция для загрузки и классификации пользовательских изображений, успешно протестированная на примере.</w:t>
+        <w:t>В ходе работы была реализована нейросетевая модель для классификации рукописных цифр MNIST, достигнута точность выше 95% на тестовых данных (98%). Проведено исследование трнх оптимизаторов и их параметров, позволившее подобрать наилучшие настройки. Лучший результат (98%) показал оптимизатор RMSprop с параметрами lr=0.001, rho=0.95, momentum=0.5. Разработана функция для загрузки и классификации пользовательских изображений, успешно протестированная на примере.</w:t>
       </w:r>
       <w:r>
         <w:br w:type="page"/>
@@ -4311,19 +3846,7 @@
         <w:rPr>
           <w:lang w:val="en-US"/>
         </w:rPr>
-        <w:t>lab</w:t>
-      </w:r>
-      <w:r>
-        <w:rPr>
-          <w:lang w:val="en-US"/>
-        </w:rPr>
-        <w:t>4</w:t>
-      </w:r>
-      <w:r>
-        <w:rPr>
-          <w:lang w:val="en-US"/>
-        </w:rPr>
-        <w:t>.ipynb</w:t>
+        <w:t>lab4.ipynb</w:t>
       </w:r>
     </w:p>
     <w:p>
@@ -10797,7 +10320,7 @@
     </w:r>
     <w:r>
       <w:rPr/>
-      <w:t>2</w:t>
+      <w:t>19</w:t>
     </w:r>
     <w:r>
       <w:rPr/>
@@ -12344,8 +11867,8 @@
     <w:qFormat/>
     <w:rPr/>
   </w:style>
-  <w:style w:type="character" w:styleId="Bullets">
-    <w:name w:val="Bullets"/>
+  <w:style w:type="character" w:styleId="Bulletsuser">
+    <w:name w:val="Bullets (user)"/>
     <w:qFormat/>
     <w:rPr>
       <w:rFonts w:ascii="OpenSymbol;Arial Unicode MS" w:hAnsi="OpenSymbol;Arial Unicode MS" w:eastAsia="OpenSymbol;Arial Unicode MS" w:cs="OpenSymbol;Arial Unicode MS"/>
@@ -12373,8 +11896,8 @@
       <w:u w:val="single"/>
     </w:rPr>
   </w:style>
-  <w:style w:type="character" w:styleId="Bulletsuser">
-    <w:name w:val="Bullets (user)"/>
+  <w:style w:type="character" w:styleId="Bullets">
+    <w:name w:val="Bullets"/>
     <w:qFormat/>
     <w:rPr>
       <w:rFonts w:ascii="OpenSymbol" w:hAnsi="OpenSymbol" w:eastAsia="OpenSymbol" w:cs="OpenSymbol"/>
@@ -12681,8 +12204,8 @@
     </w:pPr>
     <w:rPr/>
   </w:style>
-  <w:style w:type="paragraph" w:styleId="FrameContentsuser">
-    <w:name w:val="Frame Contents (user)"/>
+  <w:style w:type="paragraph" w:styleId="FrameContents">
+    <w:name w:val="Frame Contents"/>
     <w:basedOn w:val="Standard"/>
     <w:qFormat/>
     <w:pPr/>

</xml_diff>